<commit_message>
Release v1.0 - Identidad visual y estabilización del sistema
</commit_message>
<xml_diff>
--- a/app/assets/templates/plantilla_certificacion_contrato.docx
+++ b/app/assets/templates/plantilla_certificacion_contrato.docx
@@ -112,6 +112,819 @@
         <w:t>que el vehículo cuyas características detallo a continuación, tiene Contrato de vinculación vigente firmado con nuestra Empresa.</w:t>
       </w:r>
     </w:p>
+    <w:tbl>
+      <w:tblPr>
+        <w:tblpPr w:leftFromText="141" w:rightFromText="141" w:vertAnchor="page" w:horzAnchor="margin" w:tblpY="5627"/>
+        <w:tblW w:w="0" w:type="auto"/>
+        <w:tblCellSpacing w:w="15" w:type="dxa"/>
+        <w:tblCellMar>
+          <w:top w:w="15" w:type="dxa"/>
+          <w:left w:w="15" w:type="dxa"/>
+          <w:bottom w:w="15" w:type="dxa"/>
+          <w:right w:w="15" w:type="dxa"/>
+        </w:tblCellMar>
+        <w:tblLook w:val="04A0" w:firstRow="1" w:lastRow="0" w:firstColumn="1" w:lastColumn="0" w:noHBand="0" w:noVBand="1"/>
+      </w:tblPr>
+      <w:tblGrid>
+        <w:gridCol w:w="4581"/>
+        <w:gridCol w:w="3447"/>
+      </w:tblGrid>
+      <w:tr>
+        <w:trPr>
+          <w:tblCellSpacing w:w="15" w:type="dxa"/>
+        </w:trPr>
+        <w:tc>
+          <w:tcPr>
+            <w:tcW w:w="4536" w:type="dxa"/>
+            <w:vAlign w:val="center"/>
+            <w:hideMark/>
+          </w:tcPr>
+          <w:p>
+            <w:pPr>
+              <w:spacing w:after="0"/>
+              <w:jc w:val="both"/>
+              <w:rPr>
+                <w:rFonts w:ascii="Bookman Old Style" w:eastAsia="Times New Roman" w:hAnsi="Bookman Old Style"/>
+                <w:i/>
+                <w:iCs/>
+                <w:sz w:val="24"/>
+                <w:szCs w:val="24"/>
+              </w:rPr>
+            </w:pPr>
+          </w:p>
+          <w:p>
+            <w:pPr>
+              <w:spacing w:after="0"/>
+              <w:jc w:val="both"/>
+              <w:rPr>
+                <w:rFonts w:ascii="Bookman Old Style" w:eastAsia="Times New Roman" w:hAnsi="Bookman Old Style"/>
+                <w:i/>
+                <w:iCs/>
+                <w:sz w:val="24"/>
+                <w:szCs w:val="24"/>
+              </w:rPr>
+            </w:pPr>
+            <w:r>
+              <w:rPr>
+                <w:rFonts w:ascii="Bookman Old Style" w:eastAsia="Times New Roman" w:hAnsi="Bookman Old Style"/>
+                <w:i/>
+                <w:iCs/>
+                <w:sz w:val="24"/>
+                <w:szCs w:val="24"/>
+              </w:rPr>
+              <w:t>FECHA INICIACIÓN CONTRATO:</w:t>
+            </w:r>
+          </w:p>
+        </w:tc>
+        <w:tc>
+          <w:tcPr>
+            <w:tcW w:w="3402" w:type="dxa"/>
+            <w:vAlign w:val="center"/>
+            <w:hideMark/>
+          </w:tcPr>
+          <w:p>
+            <w:pPr>
+              <w:spacing w:after="0"/>
+              <w:jc w:val="right"/>
+              <w:rPr>
+                <w:rFonts w:ascii="Bookman Old Style" w:eastAsia="Times New Roman" w:hAnsi="Bookman Old Style"/>
+                <w:i/>
+                <w:iCs/>
+                <w:sz w:val="24"/>
+                <w:szCs w:val="24"/>
+              </w:rPr>
+            </w:pPr>
+            <w:r>
+              <w:rPr>
+                <w:rFonts w:ascii="Bookman Old Style" w:eastAsia="Times New Roman" w:hAnsi="Bookman Old Style"/>
+                <w:i/>
+                <w:iCs/>
+                <w:sz w:val="24"/>
+                <w:szCs w:val="24"/>
+              </w:rPr>
+              <w:t>{{</w:t>
+            </w:r>
+            <w:proofErr w:type="spellStart"/>
+            <w:r>
+              <w:rPr>
+                <w:rFonts w:ascii="Bookman Old Style" w:eastAsia="Times New Roman" w:hAnsi="Bookman Old Style"/>
+                <w:i/>
+                <w:iCs/>
+                <w:sz w:val="24"/>
+                <w:szCs w:val="24"/>
+              </w:rPr>
+              <w:t>fecha_inicio</w:t>
+            </w:r>
+            <w:proofErr w:type="spellEnd"/>
+            <w:r>
+              <w:rPr>
+                <w:rFonts w:ascii="Bookman Old Style" w:eastAsia="Times New Roman" w:hAnsi="Bookman Old Style"/>
+                <w:i/>
+                <w:iCs/>
+                <w:sz w:val="24"/>
+                <w:szCs w:val="24"/>
+              </w:rPr>
+              <w:t>}}</w:t>
+            </w:r>
+          </w:p>
+        </w:tc>
+      </w:tr>
+      <w:tr>
+        <w:trPr>
+          <w:tblCellSpacing w:w="15" w:type="dxa"/>
+        </w:trPr>
+        <w:tc>
+          <w:tcPr>
+            <w:tcW w:w="4536" w:type="dxa"/>
+            <w:vAlign w:val="center"/>
+            <w:hideMark/>
+          </w:tcPr>
+          <w:p>
+            <w:pPr>
+              <w:spacing w:after="0"/>
+              <w:jc w:val="both"/>
+              <w:rPr>
+                <w:rFonts w:ascii="Bookman Old Style" w:eastAsia="Times New Roman" w:hAnsi="Bookman Old Style"/>
+                <w:i/>
+                <w:iCs/>
+                <w:sz w:val="24"/>
+                <w:szCs w:val="24"/>
+              </w:rPr>
+            </w:pPr>
+            <w:r>
+              <w:rPr>
+                <w:rFonts w:ascii="Bookman Old Style" w:eastAsia="Times New Roman" w:hAnsi="Bookman Old Style"/>
+                <w:i/>
+                <w:iCs/>
+                <w:sz w:val="24"/>
+                <w:szCs w:val="24"/>
+              </w:rPr>
+              <w:t>FECHA TERMINACIÓN CONTRATO:</w:t>
+            </w:r>
+          </w:p>
+        </w:tc>
+        <w:tc>
+          <w:tcPr>
+            <w:tcW w:w="3402" w:type="dxa"/>
+            <w:vAlign w:val="center"/>
+            <w:hideMark/>
+          </w:tcPr>
+          <w:p>
+            <w:pPr>
+              <w:spacing w:after="0"/>
+              <w:jc w:val="right"/>
+              <w:rPr>
+                <w:rFonts w:ascii="Bookman Old Style" w:eastAsia="Times New Roman" w:hAnsi="Bookman Old Style"/>
+                <w:i/>
+                <w:iCs/>
+                <w:sz w:val="24"/>
+                <w:szCs w:val="24"/>
+              </w:rPr>
+            </w:pPr>
+            <w:r>
+              <w:rPr>
+                <w:rFonts w:ascii="Bookman Old Style" w:eastAsia="Times New Roman" w:hAnsi="Bookman Old Style"/>
+                <w:i/>
+                <w:iCs/>
+                <w:sz w:val="24"/>
+                <w:szCs w:val="24"/>
+              </w:rPr>
+              <w:t>{{</w:t>
+            </w:r>
+            <w:proofErr w:type="spellStart"/>
+            <w:r>
+              <w:rPr>
+                <w:rFonts w:ascii="Bookman Old Style" w:eastAsia="Times New Roman" w:hAnsi="Bookman Old Style"/>
+                <w:i/>
+                <w:iCs/>
+                <w:sz w:val="24"/>
+                <w:szCs w:val="24"/>
+              </w:rPr>
+              <w:t>fecha_fin</w:t>
+            </w:r>
+            <w:proofErr w:type="spellEnd"/>
+            <w:r>
+              <w:rPr>
+                <w:rFonts w:ascii="Bookman Old Style" w:eastAsia="Times New Roman" w:hAnsi="Bookman Old Style"/>
+                <w:i/>
+                <w:iCs/>
+                <w:sz w:val="24"/>
+                <w:szCs w:val="24"/>
+              </w:rPr>
+              <w:t>}}</w:t>
+            </w:r>
+          </w:p>
+        </w:tc>
+      </w:tr>
+      <w:tr>
+        <w:trPr>
+          <w:tblCellSpacing w:w="15" w:type="dxa"/>
+        </w:trPr>
+        <w:tc>
+          <w:tcPr>
+            <w:tcW w:w="4536" w:type="dxa"/>
+            <w:vAlign w:val="center"/>
+            <w:hideMark/>
+          </w:tcPr>
+          <w:p>
+            <w:pPr>
+              <w:spacing w:after="0"/>
+              <w:jc w:val="both"/>
+              <w:rPr>
+                <w:rFonts w:ascii="Bookman Old Style" w:eastAsia="Times New Roman" w:hAnsi="Bookman Old Style"/>
+                <w:i/>
+                <w:iCs/>
+                <w:sz w:val="24"/>
+                <w:szCs w:val="24"/>
+              </w:rPr>
+            </w:pPr>
+            <w:r>
+              <w:rPr>
+                <w:rFonts w:ascii="Bookman Old Style" w:eastAsia="Times New Roman" w:hAnsi="Bookman Old Style"/>
+                <w:i/>
+                <w:iCs/>
+                <w:sz w:val="24"/>
+                <w:szCs w:val="24"/>
+              </w:rPr>
+              <w:t>FECHA FIRMA DEL CONTRATO:</w:t>
+            </w:r>
+          </w:p>
+        </w:tc>
+        <w:tc>
+          <w:tcPr>
+            <w:tcW w:w="3402" w:type="dxa"/>
+            <w:vAlign w:val="center"/>
+            <w:hideMark/>
+          </w:tcPr>
+          <w:p>
+            <w:pPr>
+              <w:spacing w:after="0"/>
+              <w:jc w:val="right"/>
+              <w:rPr>
+                <w:rFonts w:ascii="Bookman Old Style" w:eastAsia="Times New Roman" w:hAnsi="Bookman Old Style"/>
+                <w:i/>
+                <w:iCs/>
+                <w:sz w:val="24"/>
+                <w:szCs w:val="24"/>
+              </w:rPr>
+            </w:pPr>
+            <w:r>
+              <w:rPr>
+                <w:rFonts w:ascii="Bookman Old Style" w:eastAsia="Times New Roman" w:hAnsi="Bookman Old Style"/>
+                <w:i/>
+                <w:iCs/>
+                <w:sz w:val="24"/>
+                <w:szCs w:val="24"/>
+              </w:rPr>
+              <w:t>{{</w:t>
+            </w:r>
+            <w:proofErr w:type="spellStart"/>
+            <w:r>
+              <w:rPr>
+                <w:rFonts w:ascii="Bookman Old Style" w:eastAsia="Times New Roman" w:hAnsi="Bookman Old Style"/>
+                <w:i/>
+                <w:iCs/>
+                <w:sz w:val="24"/>
+                <w:szCs w:val="24"/>
+              </w:rPr>
+              <w:t>fecha_firma</w:t>
+            </w:r>
+            <w:proofErr w:type="spellEnd"/>
+            <w:r>
+              <w:rPr>
+                <w:rFonts w:ascii="Bookman Old Style" w:eastAsia="Times New Roman" w:hAnsi="Bookman Old Style"/>
+                <w:i/>
+                <w:iCs/>
+                <w:sz w:val="24"/>
+                <w:szCs w:val="24"/>
+              </w:rPr>
+              <w:t>}}</w:t>
+            </w:r>
+          </w:p>
+        </w:tc>
+      </w:tr>
+      <w:tr>
+        <w:trPr>
+          <w:tblCellSpacing w:w="15" w:type="dxa"/>
+        </w:trPr>
+        <w:tc>
+          <w:tcPr>
+            <w:tcW w:w="4536" w:type="dxa"/>
+            <w:vAlign w:val="center"/>
+            <w:hideMark/>
+          </w:tcPr>
+          <w:p>
+            <w:pPr>
+              <w:spacing w:after="0"/>
+              <w:jc w:val="both"/>
+              <w:rPr>
+                <w:rFonts w:ascii="Bookman Old Style" w:eastAsia="Times New Roman" w:hAnsi="Bookman Old Style"/>
+                <w:i/>
+                <w:iCs/>
+                <w:sz w:val="24"/>
+                <w:szCs w:val="24"/>
+              </w:rPr>
+            </w:pPr>
+            <w:r>
+              <w:rPr>
+                <w:rFonts w:ascii="Bookman Old Style" w:eastAsia="Times New Roman" w:hAnsi="Bookman Old Style"/>
+                <w:i/>
+                <w:iCs/>
+                <w:sz w:val="24"/>
+                <w:szCs w:val="24"/>
+              </w:rPr>
+              <w:t>DURACIÓN CONTRATO:</w:t>
+            </w:r>
+          </w:p>
+        </w:tc>
+        <w:tc>
+          <w:tcPr>
+            <w:tcW w:w="3402" w:type="dxa"/>
+            <w:vAlign w:val="center"/>
+            <w:hideMark/>
+          </w:tcPr>
+          <w:p>
+            <w:pPr>
+              <w:spacing w:after="0"/>
+              <w:jc w:val="right"/>
+              <w:rPr>
+                <w:rFonts w:ascii="Bookman Old Style" w:eastAsia="Times New Roman" w:hAnsi="Bookman Old Style"/>
+                <w:i/>
+                <w:iCs/>
+                <w:sz w:val="24"/>
+                <w:szCs w:val="24"/>
+              </w:rPr>
+            </w:pPr>
+            <w:r>
+              <w:rPr>
+                <w:rFonts w:ascii="Bookman Old Style" w:eastAsia="Times New Roman" w:hAnsi="Bookman Old Style"/>
+                <w:i/>
+                <w:iCs/>
+                <w:sz w:val="24"/>
+                <w:szCs w:val="24"/>
+              </w:rPr>
+              <w:t>{{</w:t>
+            </w:r>
+            <w:proofErr w:type="spellStart"/>
+            <w:r>
+              <w:rPr>
+                <w:rFonts w:ascii="Bookman Old Style" w:eastAsia="Times New Roman" w:hAnsi="Bookman Old Style"/>
+                <w:i/>
+                <w:iCs/>
+                <w:sz w:val="24"/>
+                <w:szCs w:val="24"/>
+              </w:rPr>
+              <w:t>duracion</w:t>
+            </w:r>
+            <w:proofErr w:type="spellEnd"/>
+            <w:r>
+              <w:rPr>
+                <w:rFonts w:ascii="Bookman Old Style" w:eastAsia="Times New Roman" w:hAnsi="Bookman Old Style"/>
+                <w:i/>
+                <w:iCs/>
+                <w:sz w:val="24"/>
+                <w:szCs w:val="24"/>
+              </w:rPr>
+              <w:t>}}</w:t>
+            </w:r>
+          </w:p>
+        </w:tc>
+      </w:tr>
+      <w:tr>
+        <w:trPr>
+          <w:tblCellSpacing w:w="15" w:type="dxa"/>
+        </w:trPr>
+        <w:tc>
+          <w:tcPr>
+            <w:tcW w:w="4536" w:type="dxa"/>
+            <w:vAlign w:val="center"/>
+            <w:hideMark/>
+          </w:tcPr>
+          <w:p>
+            <w:pPr>
+              <w:spacing w:after="0"/>
+              <w:jc w:val="both"/>
+              <w:rPr>
+                <w:rFonts w:ascii="Bookman Old Style" w:eastAsia="Times New Roman" w:hAnsi="Bookman Old Style"/>
+                <w:i/>
+                <w:iCs/>
+                <w:sz w:val="24"/>
+                <w:szCs w:val="24"/>
+              </w:rPr>
+            </w:pPr>
+            <w:r>
+              <w:rPr>
+                <w:rFonts w:ascii="Bookman Old Style" w:eastAsia="Times New Roman" w:hAnsi="Bookman Old Style"/>
+                <w:i/>
+                <w:iCs/>
+                <w:sz w:val="24"/>
+                <w:szCs w:val="24"/>
+              </w:rPr>
+              <w:t>PROPIETARIO:</w:t>
+            </w:r>
+          </w:p>
+        </w:tc>
+        <w:tc>
+          <w:tcPr>
+            <w:tcW w:w="3402" w:type="dxa"/>
+            <w:vAlign w:val="center"/>
+            <w:hideMark/>
+          </w:tcPr>
+          <w:p>
+            <w:pPr>
+              <w:spacing w:after="0"/>
+              <w:jc w:val="right"/>
+              <w:rPr>
+                <w:rFonts w:ascii="Bookman Old Style" w:eastAsia="Times New Roman" w:hAnsi="Bookman Old Style"/>
+                <w:i/>
+                <w:iCs/>
+                <w:sz w:val="24"/>
+                <w:szCs w:val="24"/>
+              </w:rPr>
+            </w:pPr>
+            <w:r>
+              <w:rPr>
+                <w:rFonts w:ascii="Bookman Old Style" w:eastAsia="Times New Roman" w:hAnsi="Bookman Old Style"/>
+                <w:i/>
+                <w:iCs/>
+                <w:sz w:val="24"/>
+                <w:szCs w:val="24"/>
+              </w:rPr>
+              <w:t>{{</w:t>
+            </w:r>
+            <w:proofErr w:type="spellStart"/>
+            <w:r>
+              <w:rPr>
+                <w:rFonts w:ascii="Bookman Old Style" w:eastAsia="Times New Roman" w:hAnsi="Bookman Old Style"/>
+                <w:i/>
+                <w:iCs/>
+                <w:sz w:val="24"/>
+                <w:szCs w:val="24"/>
+              </w:rPr>
+              <w:t>nombre_propietario</w:t>
+            </w:r>
+            <w:proofErr w:type="spellEnd"/>
+            <w:r>
+              <w:rPr>
+                <w:rFonts w:ascii="Bookman Old Style" w:eastAsia="Times New Roman" w:hAnsi="Bookman Old Style"/>
+                <w:i/>
+                <w:iCs/>
+                <w:sz w:val="24"/>
+                <w:szCs w:val="24"/>
+              </w:rPr>
+              <w:t>}}</w:t>
+            </w:r>
+          </w:p>
+        </w:tc>
+      </w:tr>
+      <w:tr>
+        <w:trPr>
+          <w:tblCellSpacing w:w="15" w:type="dxa"/>
+        </w:trPr>
+        <w:tc>
+          <w:tcPr>
+            <w:tcW w:w="4536" w:type="dxa"/>
+            <w:vAlign w:val="center"/>
+            <w:hideMark/>
+          </w:tcPr>
+          <w:p>
+            <w:pPr>
+              <w:spacing w:after="0"/>
+              <w:jc w:val="both"/>
+              <w:rPr>
+                <w:rFonts w:ascii="Bookman Old Style" w:eastAsia="Times New Roman" w:hAnsi="Bookman Old Style"/>
+                <w:i/>
+                <w:iCs/>
+                <w:sz w:val="24"/>
+                <w:szCs w:val="24"/>
+              </w:rPr>
+            </w:pPr>
+            <w:r>
+              <w:rPr>
+                <w:rFonts w:ascii="Bookman Old Style" w:eastAsia="Times New Roman" w:hAnsi="Bookman Old Style"/>
+                <w:i/>
+                <w:iCs/>
+                <w:sz w:val="24"/>
+                <w:szCs w:val="24"/>
+              </w:rPr>
+              <w:t>CÉDULA O NIT:</w:t>
+            </w:r>
+          </w:p>
+        </w:tc>
+        <w:tc>
+          <w:tcPr>
+            <w:tcW w:w="3402" w:type="dxa"/>
+            <w:vAlign w:val="center"/>
+            <w:hideMark/>
+          </w:tcPr>
+          <w:p>
+            <w:pPr>
+              <w:spacing w:after="0"/>
+              <w:jc w:val="right"/>
+              <w:rPr>
+                <w:rFonts w:ascii="Bookman Old Style" w:eastAsia="Times New Roman" w:hAnsi="Bookman Old Style"/>
+                <w:i/>
+                <w:iCs/>
+                <w:sz w:val="24"/>
+                <w:szCs w:val="24"/>
+              </w:rPr>
+            </w:pPr>
+            <w:r>
+              <w:rPr>
+                <w:rFonts w:ascii="Bookman Old Style" w:eastAsia="Times New Roman" w:hAnsi="Bookman Old Style"/>
+                <w:i/>
+                <w:iCs/>
+                <w:sz w:val="24"/>
+                <w:szCs w:val="24"/>
+              </w:rPr>
+              <w:t>{{documento}}</w:t>
+            </w:r>
+          </w:p>
+        </w:tc>
+      </w:tr>
+      <w:tr>
+        <w:trPr>
+          <w:tblCellSpacing w:w="15" w:type="dxa"/>
+        </w:trPr>
+        <w:tc>
+          <w:tcPr>
+            <w:tcW w:w="4536" w:type="dxa"/>
+            <w:vAlign w:val="center"/>
+            <w:hideMark/>
+          </w:tcPr>
+          <w:p>
+            <w:pPr>
+              <w:spacing w:after="0"/>
+              <w:jc w:val="both"/>
+              <w:rPr>
+                <w:rFonts w:ascii="Bookman Old Style" w:eastAsia="Times New Roman" w:hAnsi="Bookman Old Style"/>
+                <w:i/>
+                <w:iCs/>
+                <w:sz w:val="24"/>
+                <w:szCs w:val="24"/>
+              </w:rPr>
+            </w:pPr>
+            <w:r>
+              <w:rPr>
+                <w:rFonts w:ascii="Bookman Old Style" w:eastAsia="Times New Roman" w:hAnsi="Bookman Old Style"/>
+                <w:i/>
+                <w:iCs/>
+                <w:sz w:val="24"/>
+                <w:szCs w:val="24"/>
+              </w:rPr>
+              <w:t>PLACA VEHÍCULO:</w:t>
+            </w:r>
+          </w:p>
+        </w:tc>
+        <w:tc>
+          <w:tcPr>
+            <w:tcW w:w="3402" w:type="dxa"/>
+            <w:vAlign w:val="center"/>
+            <w:hideMark/>
+          </w:tcPr>
+          <w:p>
+            <w:pPr>
+              <w:spacing w:after="0"/>
+              <w:jc w:val="right"/>
+              <w:rPr>
+                <w:rFonts w:ascii="Bookman Old Style" w:eastAsia="Times New Roman" w:hAnsi="Bookman Old Style"/>
+                <w:i/>
+                <w:iCs/>
+                <w:sz w:val="24"/>
+                <w:szCs w:val="24"/>
+              </w:rPr>
+            </w:pPr>
+            <w:r>
+              <w:rPr>
+                <w:rFonts w:ascii="Bookman Old Style" w:eastAsia="Times New Roman" w:hAnsi="Bookman Old Style"/>
+                <w:i/>
+                <w:iCs/>
+                <w:sz w:val="24"/>
+                <w:szCs w:val="24"/>
+              </w:rPr>
+              <w:t>{{placa}}</w:t>
+            </w:r>
+          </w:p>
+        </w:tc>
+      </w:tr>
+      <w:tr>
+        <w:trPr>
+          <w:tblCellSpacing w:w="15" w:type="dxa"/>
+        </w:trPr>
+        <w:tc>
+          <w:tcPr>
+            <w:tcW w:w="4536" w:type="dxa"/>
+            <w:vAlign w:val="center"/>
+            <w:hideMark/>
+          </w:tcPr>
+          <w:p>
+            <w:pPr>
+              <w:spacing w:after="0"/>
+              <w:jc w:val="both"/>
+              <w:rPr>
+                <w:rFonts w:ascii="Bookman Old Style" w:eastAsia="Times New Roman" w:hAnsi="Bookman Old Style"/>
+                <w:i/>
+                <w:iCs/>
+                <w:sz w:val="24"/>
+                <w:szCs w:val="24"/>
+              </w:rPr>
+            </w:pPr>
+            <w:r>
+              <w:rPr>
+                <w:rFonts w:ascii="Bookman Old Style" w:eastAsia="Times New Roman" w:hAnsi="Bookman Old Style"/>
+                <w:i/>
+                <w:iCs/>
+                <w:sz w:val="24"/>
+                <w:szCs w:val="24"/>
+              </w:rPr>
+              <w:t>MARCA:</w:t>
+            </w:r>
+          </w:p>
+        </w:tc>
+        <w:tc>
+          <w:tcPr>
+            <w:tcW w:w="3402" w:type="dxa"/>
+            <w:vAlign w:val="center"/>
+            <w:hideMark/>
+          </w:tcPr>
+          <w:p>
+            <w:pPr>
+              <w:spacing w:after="0"/>
+              <w:jc w:val="right"/>
+              <w:rPr>
+                <w:rFonts w:ascii="Bookman Old Style" w:eastAsia="Times New Roman" w:hAnsi="Bookman Old Style"/>
+                <w:i/>
+                <w:iCs/>
+                <w:sz w:val="24"/>
+                <w:szCs w:val="24"/>
+              </w:rPr>
+            </w:pPr>
+            <w:r>
+              <w:rPr>
+                <w:rFonts w:ascii="Bookman Old Style" w:eastAsia="Times New Roman" w:hAnsi="Bookman Old Style"/>
+                <w:i/>
+                <w:iCs/>
+                <w:sz w:val="24"/>
+                <w:szCs w:val="24"/>
+              </w:rPr>
+              <w:t>{{marca}}</w:t>
+            </w:r>
+          </w:p>
+        </w:tc>
+      </w:tr>
+      <w:tr>
+        <w:trPr>
+          <w:tblCellSpacing w:w="15" w:type="dxa"/>
+        </w:trPr>
+        <w:tc>
+          <w:tcPr>
+            <w:tcW w:w="4536" w:type="dxa"/>
+            <w:vAlign w:val="center"/>
+            <w:hideMark/>
+          </w:tcPr>
+          <w:p>
+            <w:pPr>
+              <w:spacing w:after="0"/>
+              <w:jc w:val="both"/>
+              <w:rPr>
+                <w:rFonts w:ascii="Bookman Old Style" w:eastAsia="Times New Roman" w:hAnsi="Bookman Old Style"/>
+                <w:i/>
+                <w:iCs/>
+                <w:sz w:val="24"/>
+                <w:szCs w:val="24"/>
+              </w:rPr>
+            </w:pPr>
+            <w:r>
+              <w:rPr>
+                <w:rFonts w:ascii="Bookman Old Style" w:eastAsia="Times New Roman" w:hAnsi="Bookman Old Style"/>
+                <w:i/>
+                <w:iCs/>
+                <w:sz w:val="24"/>
+                <w:szCs w:val="24"/>
+              </w:rPr>
+              <w:t>MODELO:</w:t>
+            </w:r>
+          </w:p>
+        </w:tc>
+        <w:tc>
+          <w:tcPr>
+            <w:tcW w:w="3402" w:type="dxa"/>
+            <w:vAlign w:val="center"/>
+            <w:hideMark/>
+          </w:tcPr>
+          <w:p>
+            <w:pPr>
+              <w:spacing w:after="0"/>
+              <w:jc w:val="right"/>
+              <w:rPr>
+                <w:rFonts w:ascii="Bookman Old Style" w:eastAsia="Times New Roman" w:hAnsi="Bookman Old Style"/>
+                <w:i/>
+                <w:iCs/>
+                <w:sz w:val="24"/>
+                <w:szCs w:val="24"/>
+              </w:rPr>
+            </w:pPr>
+            <w:r>
+              <w:rPr>
+                <w:rFonts w:ascii="Bookman Old Style" w:eastAsia="Times New Roman" w:hAnsi="Bookman Old Style"/>
+                <w:i/>
+                <w:iCs/>
+                <w:sz w:val="24"/>
+                <w:szCs w:val="24"/>
+              </w:rPr>
+              <w:t>{{modelo}}</w:t>
+            </w:r>
+          </w:p>
+        </w:tc>
+      </w:tr>
+      <w:tr>
+        <w:trPr>
+          <w:tblCellSpacing w:w="15" w:type="dxa"/>
+        </w:trPr>
+        <w:tc>
+          <w:tcPr>
+            <w:tcW w:w="4536" w:type="dxa"/>
+            <w:vAlign w:val="center"/>
+            <w:hideMark/>
+          </w:tcPr>
+          <w:p>
+            <w:pPr>
+              <w:spacing w:after="0"/>
+              <w:jc w:val="both"/>
+              <w:rPr>
+                <w:rFonts w:ascii="Bookman Old Style" w:eastAsia="Times New Roman" w:hAnsi="Bookman Old Style"/>
+                <w:i/>
+                <w:iCs/>
+                <w:sz w:val="24"/>
+                <w:szCs w:val="24"/>
+              </w:rPr>
+            </w:pPr>
+            <w:r>
+              <w:rPr>
+                <w:rFonts w:ascii="Bookman Old Style" w:eastAsia="Times New Roman" w:hAnsi="Bookman Old Style"/>
+                <w:i/>
+                <w:iCs/>
+                <w:sz w:val="24"/>
+                <w:szCs w:val="24"/>
+              </w:rPr>
+              <w:t>NÚMERO DE MOTOR:</w:t>
+            </w:r>
+          </w:p>
+        </w:tc>
+        <w:tc>
+          <w:tcPr>
+            <w:tcW w:w="3402" w:type="dxa"/>
+            <w:vAlign w:val="center"/>
+            <w:hideMark/>
+          </w:tcPr>
+          <w:p>
+            <w:pPr>
+              <w:spacing w:after="0"/>
+              <w:jc w:val="right"/>
+              <w:rPr>
+                <w:rFonts w:ascii="Bookman Old Style" w:eastAsia="Times New Roman" w:hAnsi="Bookman Old Style"/>
+                <w:i/>
+                <w:iCs/>
+                <w:sz w:val="24"/>
+                <w:szCs w:val="24"/>
+              </w:rPr>
+            </w:pPr>
+            <w:r>
+              <w:rPr>
+                <w:rFonts w:ascii="Bookman Old Style" w:eastAsia="Times New Roman" w:hAnsi="Bookman Old Style"/>
+                <w:i/>
+                <w:iCs/>
+                <w:sz w:val="24"/>
+                <w:szCs w:val="24"/>
+              </w:rPr>
+              <w:t>{{</w:t>
+            </w:r>
+            <w:proofErr w:type="spellStart"/>
+            <w:r>
+              <w:rPr>
+                <w:rFonts w:ascii="Bookman Old Style" w:eastAsia="Times New Roman" w:hAnsi="Bookman Old Style"/>
+                <w:i/>
+                <w:iCs/>
+                <w:sz w:val="24"/>
+                <w:szCs w:val="24"/>
+              </w:rPr>
+              <w:t>numero_motor</w:t>
+            </w:r>
+            <w:proofErr w:type="spellEnd"/>
+            <w:r>
+              <w:rPr>
+                <w:rFonts w:ascii="Bookman Old Style" w:eastAsia="Times New Roman" w:hAnsi="Bookman Old Style"/>
+                <w:i/>
+                <w:iCs/>
+                <w:sz w:val="24"/>
+                <w:szCs w:val="24"/>
+              </w:rPr>
+              <w:t>}}</w:t>
+            </w:r>
+          </w:p>
+        </w:tc>
+      </w:tr>
+    </w:tbl>
     <w:p>
       <w:pPr>
         <w:jc w:val="both"/>
@@ -136,16 +949,6 @@
           <w:szCs w:val="24"/>
         </w:rPr>
       </w:pPr>
-      <w:r>
-        <w:rPr>
-          <w:rFonts w:ascii="Bookman Old Style" w:hAnsi="Bookman Old Style"/>
-          <w:i/>
-          <w:iCs/>
-          <w:sz w:val="24"/>
-          <w:szCs w:val="24"/>
-        </w:rPr>
-        <w:t>Fecha Iniciación Contrato: {{fecha_inicio}}</w:t>
-      </w:r>
     </w:p>
     <w:p>
       <w:pPr>
@@ -159,16 +962,6 @@
           <w:szCs w:val="24"/>
         </w:rPr>
       </w:pPr>
-      <w:r>
-        <w:rPr>
-          <w:rFonts w:ascii="Bookman Old Style" w:hAnsi="Bookman Old Style"/>
-          <w:i/>
-          <w:iCs/>
-          <w:sz w:val="24"/>
-          <w:szCs w:val="24"/>
-        </w:rPr>
-        <w:t>Fecha Terminación Contrato: {{fecha_fin}}</w:t>
-      </w:r>
     </w:p>
     <w:p>
       <w:pPr>
@@ -182,16 +975,6 @@
           <w:szCs w:val="24"/>
         </w:rPr>
       </w:pPr>
-      <w:r>
-        <w:rPr>
-          <w:rFonts w:ascii="Bookman Old Style" w:hAnsi="Bookman Old Style"/>
-          <w:i/>
-          <w:iCs/>
-          <w:sz w:val="24"/>
-          <w:szCs w:val="24"/>
-        </w:rPr>
-        <w:t>Fecha firma del Contrato: {{fecha_firma}}</w:t>
-      </w:r>
     </w:p>
     <w:p>
       <w:pPr>
@@ -205,16 +988,6 @@
           <w:szCs w:val="24"/>
         </w:rPr>
       </w:pPr>
-      <w:r>
-        <w:rPr>
-          <w:rFonts w:ascii="Bookman Old Style" w:hAnsi="Bookman Old Style"/>
-          <w:i/>
-          <w:iCs/>
-          <w:sz w:val="24"/>
-          <w:szCs w:val="24"/>
-        </w:rPr>
-        <w:t>Duración Contrato: {{duracion}}</w:t>
-      </w:r>
     </w:p>
     <w:p>
       <w:pPr>
@@ -228,16 +1001,6 @@
           <w:szCs w:val="24"/>
         </w:rPr>
       </w:pPr>
-      <w:r>
-        <w:rPr>
-          <w:rFonts w:ascii="Bookman Old Style" w:hAnsi="Bookman Old Style"/>
-          <w:i/>
-          <w:iCs/>
-          <w:sz w:val="24"/>
-          <w:szCs w:val="24"/>
-        </w:rPr>
-        <w:t>Propietario: {{nombre_propietario}}</w:t>
-      </w:r>
     </w:p>
     <w:p>
       <w:pPr>
@@ -251,16 +1014,6 @@
           <w:szCs w:val="24"/>
         </w:rPr>
       </w:pPr>
-      <w:r>
-        <w:rPr>
-          <w:rFonts w:ascii="Bookman Old Style" w:hAnsi="Bookman Old Style"/>
-          <w:i/>
-          <w:iCs/>
-          <w:sz w:val="24"/>
-          <w:szCs w:val="24"/>
-        </w:rPr>
-        <w:t>Cédula o Nit: {{documento}}</w:t>
-      </w:r>
     </w:p>
     <w:p>
       <w:pPr>
@@ -274,16 +1027,6 @@
           <w:szCs w:val="24"/>
         </w:rPr>
       </w:pPr>
-      <w:r>
-        <w:rPr>
-          <w:rFonts w:ascii="Bookman Old Style" w:hAnsi="Bookman Old Style"/>
-          <w:i/>
-          <w:iCs/>
-          <w:sz w:val="24"/>
-          <w:szCs w:val="24"/>
-        </w:rPr>
-        <w:t>Placa Vehículo: {{placa}}</w:t>
-      </w:r>
     </w:p>
     <w:p>
       <w:pPr>
@@ -297,16 +1040,6 @@
           <w:szCs w:val="24"/>
         </w:rPr>
       </w:pPr>
-      <w:r>
-        <w:rPr>
-          <w:rFonts w:ascii="Bookman Old Style" w:hAnsi="Bookman Old Style"/>
-          <w:i/>
-          <w:iCs/>
-          <w:sz w:val="24"/>
-          <w:szCs w:val="24"/>
-        </w:rPr>
-        <w:t>Marca: {{marca}}</w:t>
-      </w:r>
     </w:p>
     <w:p>
       <w:pPr>
@@ -320,39 +1053,6 @@
           <w:szCs w:val="24"/>
         </w:rPr>
       </w:pPr>
-      <w:r>
-        <w:rPr>
-          <w:rFonts w:ascii="Bookman Old Style" w:hAnsi="Bookman Old Style"/>
-          <w:i/>
-          <w:iCs/>
-          <w:sz w:val="24"/>
-          <w:szCs w:val="24"/>
-        </w:rPr>
-        <w:t>Modelo: {{modelo}}</w:t>
-      </w:r>
-    </w:p>
-    <w:p>
-      <w:pPr>
-        <w:spacing w:line="240" w:lineRule="auto"/>
-        <w:jc w:val="both"/>
-        <w:rPr>
-          <w:rFonts w:ascii="Bookman Old Style" w:hAnsi="Bookman Old Style"/>
-          <w:i/>
-          <w:iCs/>
-          <w:sz w:val="24"/>
-          <w:szCs w:val="24"/>
-        </w:rPr>
-      </w:pPr>
-      <w:r>
-        <w:rPr>
-          <w:rFonts w:ascii="Bookman Old Style" w:hAnsi="Bookman Old Style"/>
-          <w:i/>
-          <w:iCs/>
-          <w:sz w:val="24"/>
-          <w:szCs w:val="24"/>
-        </w:rPr>
-        <w:t>Número de Motor: {{numero_motor}}</w:t>
-      </w:r>
     </w:p>
     <w:p>
       <w:pPr>
@@ -397,7 +1097,29 @@
           <w:sz w:val="24"/>
           <w:szCs w:val="24"/>
         </w:rPr>
-        <w:t>{{fecha_emision}}.</w:t>
+        <w:t>{{</w:t>
+      </w:r>
+      <w:proofErr w:type="spellStart"/>
+      <w:r>
+        <w:rPr>
+          <w:rFonts w:ascii="Bookman Old Style" w:hAnsi="Bookman Old Style"/>
+          <w:i/>
+          <w:iCs/>
+          <w:sz w:val="24"/>
+          <w:szCs w:val="24"/>
+        </w:rPr>
+        <w:t>fecha_emision</w:t>
+      </w:r>
+      <w:proofErr w:type="spellEnd"/>
+      <w:r>
+        <w:rPr>
+          <w:rFonts w:ascii="Bookman Old Style" w:hAnsi="Bookman Old Style"/>
+          <w:i/>
+          <w:iCs/>
+          <w:sz w:val="24"/>
+          <w:szCs w:val="24"/>
+        </w:rPr>
+        <w:t>}}.</w:t>
       </w:r>
     </w:p>
     <w:p>
@@ -583,6 +1305,32 @@
         </w:rPr>
         <w:t>Gerente</w:t>
       </w:r>
+    </w:p>
+    <w:p>
+      <w:pPr>
+        <w:spacing w:after="0"/>
+        <w:jc w:val="both"/>
+        <w:rPr>
+          <w:rFonts w:ascii="Bookman Old Style" w:eastAsia="Times New Roman" w:hAnsi="Bookman Old Style"/>
+          <w:i/>
+          <w:iCs/>
+          <w:sz w:val="24"/>
+          <w:szCs w:val="24"/>
+        </w:rPr>
+      </w:pPr>
+    </w:p>
+    <w:p>
+      <w:pPr>
+        <w:spacing w:after="0"/>
+        <w:jc w:val="both"/>
+        <w:rPr>
+          <w:rFonts w:ascii="Bookman Old Style" w:eastAsia="Times New Roman" w:hAnsi="Bookman Old Style"/>
+          <w:i/>
+          <w:iCs/>
+          <w:sz w:val="24"/>
+          <w:szCs w:val="24"/>
+        </w:rPr>
+      </w:pPr>
     </w:p>
     <w:sectPr>
       <w:headerReference w:type="default" r:id="rId7"/>
@@ -9379,7 +10127,7 @@
   <w:style w:type="paragraph" w:default="1" w:styleId="Normal">
     <w:name w:val="Normal"/>
     <w:qFormat/>
-    <w:rsid w:val="00002626"/>
+    <w:rsid w:val="00653B03"/>
   </w:style>
   <w:style w:type="paragraph" w:styleId="Ttulo1">
     <w:name w:val="heading 1"/>
@@ -9468,6 +10216,7 @@
   <w:style w:type="character" w:default="1" w:styleId="Fuentedeprrafopredeter">
     <w:name w:val="Default Paragraph Font"/>
     <w:uiPriority w:val="1"/>
+    <w:semiHidden/>
     <w:unhideWhenUsed/>
   </w:style>
   <w:style w:type="table" w:default="1" w:styleId="Tablanormal">

</xml_diff>